<commit_message>
Finished Implementation / Deployment
</commit_message>
<xml_diff>
--- a/report/Insurance_Project.docx
+++ b/report/Insurance_Project.docx
@@ -1002,6 +1002,13 @@
         <w:t>from this can see that the region with higher smoking rates had higher claims</w:t>
       </w:r>
     </w:p>
+    <w:p/>
+    <w:p>
+      <w:r>
+        <w:t>2. building models</w:t>
+      </w:r>
+    </w:p>
+    <w:p/>
     <w:p/>
     <w:p/>
     <w:p/>

</xml_diff>